<commit_message>
Add project documentation: requirements, technical spec, and lessons learned
Three markdown documents covering the full project scope:
- Requirements & User Stories (Developer + Builder personas)
- Technical Build Specification (all 11 components)
- Lessons Learned (framework bugs, vector search, token optimization)

Also includes updated .docx exports and their build scripts.

Co-Authored-By: Claude Opus 4.6 <noreply@anthropic.com>
</commit_message>
<xml_diff>
--- a/docs/Health_Interop_Agentic_Framework_Dev_Spec.docx
+++ b/docs/Health_Interop_Agentic_Framework_Dev_Spec.docx
@@ -60,6 +60,14 @@
     </w:p>
     <w:sdt>
       <w:sdtPr>
+        <w:rPr>
+          <w:rFonts w:ascii="Calibri" w:eastAsiaTheme="minorEastAsia" w:hAnsi="Calibri" w:cstheme="minorBidi"/>
+          <w:b w:val="0"/>
+          <w:bCs w:val="0"/>
+          <w:color w:val="333333"/>
+          <w:sz w:val="22"/>
+          <w:szCs w:val="22"/>
+        </w:rPr>
         <w:id w:val="9422176"/>
         <w:docPartObj>
           <w:docPartGallery w:val="Table of Contents"/>
@@ -68,11 +76,7 @@
       </w:sdtPr>
       <w:sdtEndPr>
         <w:rPr>
-          <w:rFonts w:ascii="Calibri" w:eastAsiaTheme="minorEastAsia" w:hAnsi="Calibri" w:cstheme="minorBidi"/>
           <w:noProof/>
-          <w:color w:val="333333"/>
-          <w:sz w:val="22"/>
-          <w:szCs w:val="22"/>
         </w:rPr>
       </w:sdtEndPr>
       <w:sdtContent>
@@ -3932,14 +3936,14 @@
               <w:rPr>
                 <w:sz w:val="20"/>
               </w:rPr>
-              <w:t xml:space="preserve">Author Tool classes in ObjectScript or Python. Write Skill documents. Build catalog embeddings. Package </w:t>
+              <w:t xml:space="preserve">Author Tool classes in ObjectScript or Python. Write Skill documents. Build catalog embeddings. Package as IPM modules. Developers define what the copilot </w:t>
             </w:r>
             <w:r>
               <w:rPr>
                 <w:sz w:val="20"/>
               </w:rPr>
               <w:lastRenderedPageBreak/>
-              <w:t>as IPM modules. Developers define what the copilot CAN do.</w:t>
+              <w:t>CAN do.</w:t>
             </w:r>
           </w:p>
         </w:tc>
@@ -3960,6 +3964,7 @@
               <w:rPr>
                 <w:sz w:val="20"/>
               </w:rPr>
+              <w:lastRenderedPageBreak/>
               <w:t>Builder (End User)</w:t>
             </w:r>
           </w:p>
@@ -4339,16 +4344,12 @@
     </w:p>
     <w:p>
       <w:r>
-        <w:t>The runtime forms a strict containment hierarchy. An Agent owns its conversation context and decides what to do next. To act, the Agent issues a Tool call against a ToolSet exposed by an MCP Server. Skills inject domain knowledge; the Catalog supplies grounded references to real IRIS artifacts.</w:t>
+        <w:t>The runtime forms a strict containment hierarchy. An Agent owns its conversation context and decides what to do next. To act, the Agent issues a Tool call against a ToolSet exposed by an MCP Server. Skills inject domain knowledge; the Catalog supplies grounded references to real IRIS artifacts</w:t>
       </w:r>
     </w:p>
     <w:p/>
-    <w:p/>
-    <w:p/>
-    <w:p/>
     <w:p>
       <w:r>
-        <w:lastRenderedPageBreak/>
         <w:t>Agent</w:t>
       </w:r>
       <w:r>
@@ -4374,6 +4375,7 @@
     </w:p>
     <w:p>
       <w:r>
+        <w:lastRenderedPageBreak/>
         <w:t>Agents never modify IRIS state directly. All mutations are performed by Tools, which apply input validation, namespace checks, approval gates, and audit logging before touching IRIS.</w:t>
       </w:r>
     </w:p>
@@ -4470,7 +4472,6 @@
         <w:pStyle w:val="ListBullet"/>
       </w:pPr>
       <w:r>
-        <w:lastRenderedPageBreak/>
         <w:t>BPL (Business Process Language) for orchestration workflows with compensation handlers, async callbacks, and code activities</w:t>
       </w:r>
     </w:p>
@@ -4511,6 +4512,7 @@
         <w:pStyle w:val="ListBullet"/>
       </w:pPr>
       <w:r>
+        <w:lastRenderedPageBreak/>
         <w:t>SDA (Summary Document Architecture) as the intermediary hub for cross-format transformations (HL7 to SDA to FHIR)</w:t>
       </w:r>
     </w:p>
@@ -4858,7 +4860,6 @@
               <w:rPr>
                 <w:sz w:val="20"/>
               </w:rPr>
-              <w:lastRenderedPageBreak/>
               <w:t>Post-build validation</w:t>
             </w:r>
           </w:p>
@@ -4966,7 +4967,14 @@
               <w:rPr>
                 <w:sz w:val="20"/>
               </w:rPr>
-              <w:t>Streaming with tool cards</w:t>
+              <w:t xml:space="preserve">Streaming with tool </w:t>
+            </w:r>
+            <w:r>
+              <w:rPr>
+                <w:sz w:val="20"/>
+              </w:rPr>
+              <w:lastRenderedPageBreak/>
+              <w:t>cards</w:t>
             </w:r>
           </w:p>
         </w:tc>
@@ -4982,7 +4990,15 @@
               <w:rPr>
                 <w:sz w:val="20"/>
               </w:rPr>
-              <w:t>A 90-second multi-step build must show real-time progress. Each tool call renders as a visible card in the chat UI.</w:t>
+              <w:lastRenderedPageBreak/>
+              <w:t xml:space="preserve">A 90-second multi-step build must show </w:t>
+            </w:r>
+            <w:r>
+              <w:rPr>
+                <w:sz w:val="20"/>
+              </w:rPr>
+              <w:lastRenderedPageBreak/>
+              <w:t>real-time progress. Each tool call renders as a visible card in the chat UI.</w:t>
             </w:r>
           </w:p>
         </w:tc>
@@ -4998,7 +5014,15 @@
               <w:rPr>
                 <w:sz w:val="20"/>
               </w:rPr>
-              <w:t>Framework (proposed) - no tool lifecycle event streaming</w:t>
+              <w:lastRenderedPageBreak/>
+              <w:t xml:space="preserve">Framework (proposed) - no tool lifecycle </w:t>
+            </w:r>
+            <w:r>
+              <w:rPr>
+                <w:sz w:val="20"/>
+              </w:rPr>
+              <w:lastRenderedPageBreak/>
+              <w:t>event streaming</w:t>
             </w:r>
           </w:p>
         </w:tc>
@@ -5019,6 +5043,7 @@
               <w:rPr>
                 <w:sz w:val="20"/>
               </w:rPr>
+              <w:lastRenderedPageBreak/>
               <w:t>Iteration limits and token budget</w:t>
             </w:r>
           </w:p>
@@ -5290,14 +5315,7 @@
               <w:rPr>
                 <w:sz w:val="20"/>
               </w:rPr>
-              <w:t xml:space="preserve">The agent must read a production's full definition: every business host, class, </w:t>
-            </w:r>
-            <w:r>
-              <w:rPr>
-                <w:sz w:val="20"/>
-              </w:rPr>
-              <w:lastRenderedPageBreak/>
-              <w:t>settings (distinguishing host-level from adapter-level), and connections.</w:t>
+              <w:t>The agent must read a production's full definition: every business host, class, settings (distinguishing host-level from adapter-level), and connections.</w:t>
             </w:r>
           </w:p>
         </w:tc>
@@ -5313,7 +5331,6 @@
               <w:rPr>
                 <w:sz w:val="20"/>
               </w:rPr>
-              <w:lastRenderedPageBreak/>
               <w:t>Application-level tools (framework must support %AI.Tool)</w:t>
             </w:r>
           </w:p>
@@ -5459,7 +5476,14 @@
               <w:rPr>
                 <w:sz w:val="20"/>
               </w:rPr>
-              <w:t>Review is entirely read-only. The framework must distinguish read-only tools (no approval needed) from mutating tools.</w:t>
+              <w:t xml:space="preserve">Review is entirely read-only. The </w:t>
+            </w:r>
+            <w:r>
+              <w:rPr>
+                <w:sz w:val="20"/>
+              </w:rPr>
+              <w:lastRenderedPageBreak/>
+              <w:t>framework must distinguish read-only tools (no approval needed) from mutating tools.</w:t>
             </w:r>
           </w:p>
         </w:tc>
@@ -5476,7 +5500,15 @@
               <w:rPr>
                 <w:sz w:val="20"/>
               </w:rPr>
-              <w:t>Framework (proposed) - MutatingOperation flag needed</w:t>
+              <w:lastRenderedPageBreak/>
+              <w:t xml:space="preserve">Framework (proposed) - </w:t>
+            </w:r>
+            <w:r>
+              <w:rPr>
+                <w:sz w:val="20"/>
+              </w:rPr>
+              <w:lastRenderedPageBreak/>
+              <w:t>MutatingOperation flag needed</w:t>
             </w:r>
           </w:p>
         </w:tc>
@@ -5496,6 +5528,7 @@
               <w:rPr>
                 <w:sz w:val="20"/>
               </w:rPr>
+              <w:lastRenderedPageBreak/>
               <w:t>Skills for best practices</w:t>
             </w:r>
           </w:p>
@@ -5686,14 +5719,7 @@
               <w:rPr>
                 <w:sz w:val="20"/>
               </w:rPr>
-              <w:t xml:space="preserve">The agent must look up exact segment paths for any HL7 message type and version. ADT_A01 and ORU_R01 have fundamentally different path structures. Guessing paths </w:t>
-            </w:r>
-            <w:r>
-              <w:rPr>
-                <w:sz w:val="20"/>
-              </w:rPr>
-              <w:lastRenderedPageBreak/>
-              <w:t>guarantees empty output.</w:t>
+              <w:t>The agent must look up exact segment paths for any HL7 message type and version. ADT_A01 and ORU_R01 have fundamentally different path structures. Guessing paths guarantees empty output.</w:t>
             </w:r>
           </w:p>
         </w:tc>
@@ -5709,7 +5735,6 @@
               <w:rPr>
                 <w:sz w:val="20"/>
               </w:rPr>
-              <w:lastRenderedPageBreak/>
               <w:t>Application-level tools</w:t>
             </w:r>
           </w:p>
@@ -5908,7 +5933,14 @@
               <w:rPr>
                 <w:sz w:val="20"/>
               </w:rPr>
-              <w:t>The agent needs deep knowledge of DTL syntax, virtual document paths, foreach patterns, subtransforms, and common pitfalls.</w:t>
+              <w:t xml:space="preserve">The agent needs deep knowledge of DTL </w:t>
+            </w:r>
+            <w:r>
+              <w:rPr>
+                <w:sz w:val="20"/>
+              </w:rPr>
+              <w:lastRenderedPageBreak/>
+              <w:t>syntax, virtual document paths, foreach patterns, subtransforms, and common pitfalls.</w:t>
             </w:r>
           </w:p>
         </w:tc>
@@ -5924,7 +5956,15 @@
               <w:rPr>
                 <w:sz w:val="20"/>
               </w:rPr>
-              <w:t>Framework (exists via %AI.Agent.Skill, pending %OnNew fix)</w:t>
+              <w:lastRenderedPageBreak/>
+              <w:t xml:space="preserve">Framework (exists via </w:t>
+            </w:r>
+            <w:r>
+              <w:rPr>
+                <w:sz w:val="20"/>
+              </w:rPr>
+              <w:lastRenderedPageBreak/>
+              <w:t>%AI.Agent.Skill, pending %OnNew fix)</w:t>
             </w:r>
           </w:p>
         </w:tc>
@@ -5945,6 +5985,7 @@
               <w:rPr>
                 <w:sz w:val="20"/>
               </w:rPr>
+              <w:lastRenderedPageBreak/>
               <w:t>Anti-fabrication enforcement</w:t>
             </w:r>
           </w:p>
@@ -6009,11 +6050,11 @@
         <w:tblLook w:val="04A0" w:firstRow="1" w:lastRow="0" w:firstColumn="1" w:lastColumn="0" w:noHBand="0" w:noVBand="1"/>
       </w:tblPr>
       <w:tblGrid>
-        <w:gridCol w:w="2169"/>
-        <w:gridCol w:w="1858"/>
-        <w:gridCol w:w="1861"/>
-        <w:gridCol w:w="1510"/>
-        <w:gridCol w:w="2224"/>
+        <w:gridCol w:w="2898"/>
+        <w:gridCol w:w="1440"/>
+        <w:gridCol w:w="1350"/>
+        <w:gridCol w:w="1530"/>
+        <w:gridCol w:w="2404"/>
       </w:tblGrid>
       <w:tr>
         <w:trPr>
@@ -6023,7 +6064,7 @@
         <w:tc>
           <w:tcPr>
             <w:cnfStyle w:val="001000000000" w:firstRow="0" w:lastRow="0" w:firstColumn="1" w:lastColumn="0" w:oddVBand="0" w:evenVBand="0" w:oddHBand="0" w:evenHBand="0" w:firstRowFirstColumn="0" w:firstRowLastColumn="0" w:lastRowFirstColumn="0" w:lastRowLastColumn="0"/>
-            <w:tcW w:w="2169" w:type="dxa"/>
+            <w:tcW w:w="2898" w:type="dxa"/>
             <w:shd w:val="clear" w:color="auto" w:fill="1A1A2E"/>
           </w:tcPr>
           <w:p>
@@ -6038,7 +6079,7 @@
         </w:tc>
         <w:tc>
           <w:tcPr>
-            <w:tcW w:w="1858" w:type="dxa"/>
+            <w:tcW w:w="1440" w:type="dxa"/>
             <w:shd w:val="clear" w:color="auto" w:fill="1A1A2E"/>
           </w:tcPr>
           <w:p>
@@ -6070,7 +6111,7 @@
         </w:tc>
         <w:tc>
           <w:tcPr>
-            <w:tcW w:w="1861" w:type="dxa"/>
+            <w:tcW w:w="1350" w:type="dxa"/>
             <w:shd w:val="clear" w:color="auto" w:fill="1A1A2E"/>
           </w:tcPr>
           <w:p>
@@ -6102,7 +6143,7 @@
         </w:tc>
         <w:tc>
           <w:tcPr>
-            <w:tcW w:w="1510" w:type="dxa"/>
+            <w:tcW w:w="1530" w:type="dxa"/>
             <w:shd w:val="clear" w:color="auto" w:fill="1A1A2E"/>
           </w:tcPr>
           <w:p>
@@ -6134,7 +6175,7 @@
         </w:tc>
         <w:tc>
           <w:tcPr>
-            <w:tcW w:w="2224" w:type="dxa"/>
+            <w:tcW w:w="2404" w:type="dxa"/>
             <w:shd w:val="clear" w:color="auto" w:fill="1A1A2E"/>
           </w:tcPr>
           <w:p>
@@ -6159,7 +6200,7 @@
         <w:tc>
           <w:tcPr>
             <w:cnfStyle w:val="001000000000" w:firstRow="0" w:lastRow="0" w:firstColumn="1" w:lastColumn="0" w:oddVBand="0" w:evenVBand="0" w:oddHBand="0" w:evenHBand="0" w:firstRowFirstColumn="0" w:firstRowLastColumn="0" w:lastRowFirstColumn="0" w:lastRowLastColumn="0"/>
-            <w:tcW w:w="2169" w:type="dxa"/>
+            <w:tcW w:w="2898" w:type="dxa"/>
           </w:tcPr>
           <w:p>
             <w:r>
@@ -6172,7 +6213,7 @@
         </w:tc>
         <w:tc>
           <w:tcPr>
-            <w:tcW w:w="1858" w:type="dxa"/>
+            <w:tcW w:w="1440" w:type="dxa"/>
           </w:tcPr>
           <w:p>
             <w:pPr>
@@ -6188,7 +6229,7 @@
         </w:tc>
         <w:tc>
           <w:tcPr>
-            <w:tcW w:w="1861" w:type="dxa"/>
+            <w:tcW w:w="1350" w:type="dxa"/>
           </w:tcPr>
           <w:p>
             <w:pPr>
@@ -6204,7 +6245,7 @@
         </w:tc>
         <w:tc>
           <w:tcPr>
-            <w:tcW w:w="1510" w:type="dxa"/>
+            <w:tcW w:w="1530" w:type="dxa"/>
           </w:tcPr>
           <w:p>
             <w:pPr>
@@ -6220,7 +6261,7 @@
         </w:tc>
         <w:tc>
           <w:tcPr>
-            <w:tcW w:w="2224" w:type="dxa"/>
+            <w:tcW w:w="2404" w:type="dxa"/>
           </w:tcPr>
           <w:p>
             <w:pPr>
@@ -6255,7 +6296,7 @@
         <w:tc>
           <w:tcPr>
             <w:cnfStyle w:val="001000000000" w:firstRow="0" w:lastRow="0" w:firstColumn="1" w:lastColumn="0" w:oddVBand="0" w:evenVBand="0" w:oddHBand="0" w:evenHBand="0" w:firstRowFirstColumn="0" w:firstRowLastColumn="0" w:lastRowFirstColumn="0" w:lastRowLastColumn="0"/>
-            <w:tcW w:w="2169" w:type="dxa"/>
+            <w:tcW w:w="2898" w:type="dxa"/>
             <w:shd w:val="clear" w:color="auto" w:fill="F5F5FA"/>
           </w:tcPr>
           <w:p>
@@ -6269,7 +6310,7 @@
         </w:tc>
         <w:tc>
           <w:tcPr>
-            <w:tcW w:w="1858" w:type="dxa"/>
+            <w:tcW w:w="1440" w:type="dxa"/>
             <w:shd w:val="clear" w:color="auto" w:fill="F5F5FA"/>
           </w:tcPr>
           <w:p>
@@ -6286,7 +6327,7 @@
         </w:tc>
         <w:tc>
           <w:tcPr>
-            <w:tcW w:w="1861" w:type="dxa"/>
+            <w:tcW w:w="1350" w:type="dxa"/>
             <w:shd w:val="clear" w:color="auto" w:fill="F5F5FA"/>
           </w:tcPr>
           <w:p>
@@ -6303,7 +6344,7 @@
         </w:tc>
         <w:tc>
           <w:tcPr>
-            <w:tcW w:w="1510" w:type="dxa"/>
+            <w:tcW w:w="1530" w:type="dxa"/>
             <w:shd w:val="clear" w:color="auto" w:fill="F5F5FA"/>
           </w:tcPr>
           <w:p>
@@ -6320,7 +6361,7 @@
         </w:tc>
         <w:tc>
           <w:tcPr>
-            <w:tcW w:w="2224" w:type="dxa"/>
+            <w:tcW w:w="2404" w:type="dxa"/>
             <w:shd w:val="clear" w:color="auto" w:fill="F5F5FA"/>
           </w:tcPr>
           <w:p>
@@ -6344,7 +6385,7 @@
         <w:tc>
           <w:tcPr>
             <w:cnfStyle w:val="001000000000" w:firstRow="0" w:lastRow="0" w:firstColumn="1" w:lastColumn="0" w:oddVBand="0" w:evenVBand="0" w:oddHBand="0" w:evenHBand="0" w:firstRowFirstColumn="0" w:firstRowLastColumn="0" w:lastRowFirstColumn="0" w:lastRowLastColumn="0"/>
-            <w:tcW w:w="2169" w:type="dxa"/>
+            <w:tcW w:w="2898" w:type="dxa"/>
           </w:tcPr>
           <w:p>
             <w:r>
@@ -6357,7 +6398,7 @@
         </w:tc>
         <w:tc>
           <w:tcPr>
-            <w:tcW w:w="1858" w:type="dxa"/>
+            <w:tcW w:w="1440" w:type="dxa"/>
           </w:tcPr>
           <w:p>
             <w:pPr>
@@ -6373,7 +6414,7 @@
         </w:tc>
         <w:tc>
           <w:tcPr>
-            <w:tcW w:w="1861" w:type="dxa"/>
+            <w:tcW w:w="1350" w:type="dxa"/>
           </w:tcPr>
           <w:p>
             <w:pPr>
@@ -6389,7 +6430,7 @@
         </w:tc>
         <w:tc>
           <w:tcPr>
-            <w:tcW w:w="1510" w:type="dxa"/>
+            <w:tcW w:w="1530" w:type="dxa"/>
           </w:tcPr>
           <w:p>
             <w:pPr>
@@ -6405,7 +6446,7 @@
         </w:tc>
         <w:tc>
           <w:tcPr>
-            <w:tcW w:w="2224" w:type="dxa"/>
+            <w:tcW w:w="2404" w:type="dxa"/>
           </w:tcPr>
           <w:p>
             <w:pPr>
@@ -6428,7 +6469,7 @@
         <w:tc>
           <w:tcPr>
             <w:cnfStyle w:val="001000000000" w:firstRow="0" w:lastRow="0" w:firstColumn="1" w:lastColumn="0" w:oddVBand="0" w:evenVBand="0" w:oddHBand="0" w:evenHBand="0" w:firstRowFirstColumn="0" w:firstRowLastColumn="0" w:lastRowFirstColumn="0" w:lastRowLastColumn="0"/>
-            <w:tcW w:w="2169" w:type="dxa"/>
+            <w:tcW w:w="2898" w:type="dxa"/>
             <w:shd w:val="clear" w:color="auto" w:fill="F5F5FA"/>
           </w:tcPr>
           <w:p>
@@ -6442,7 +6483,7 @@
         </w:tc>
         <w:tc>
           <w:tcPr>
-            <w:tcW w:w="1858" w:type="dxa"/>
+            <w:tcW w:w="1440" w:type="dxa"/>
             <w:shd w:val="clear" w:color="auto" w:fill="F5F5FA"/>
           </w:tcPr>
           <w:p>
@@ -6459,7 +6500,7 @@
         </w:tc>
         <w:tc>
           <w:tcPr>
-            <w:tcW w:w="1861" w:type="dxa"/>
+            <w:tcW w:w="1350" w:type="dxa"/>
             <w:shd w:val="clear" w:color="auto" w:fill="F5F5FA"/>
           </w:tcPr>
           <w:p>
@@ -6476,7 +6517,7 @@
         </w:tc>
         <w:tc>
           <w:tcPr>
-            <w:tcW w:w="1510" w:type="dxa"/>
+            <w:tcW w:w="1530" w:type="dxa"/>
             <w:shd w:val="clear" w:color="auto" w:fill="F5F5FA"/>
           </w:tcPr>
           <w:p>
@@ -6493,7 +6534,7 @@
         </w:tc>
         <w:tc>
           <w:tcPr>
-            <w:tcW w:w="2224" w:type="dxa"/>
+            <w:tcW w:w="2404" w:type="dxa"/>
             <w:shd w:val="clear" w:color="auto" w:fill="F5F5FA"/>
           </w:tcPr>
           <w:p>
@@ -6517,7 +6558,7 @@
         <w:tc>
           <w:tcPr>
             <w:cnfStyle w:val="001000000000" w:firstRow="0" w:lastRow="0" w:firstColumn="1" w:lastColumn="0" w:oddVBand="0" w:evenVBand="0" w:oddHBand="0" w:evenHBand="0" w:firstRowFirstColumn="0" w:firstRowLastColumn="0" w:lastRowFirstColumn="0" w:lastRowLastColumn="0"/>
-            <w:tcW w:w="2169" w:type="dxa"/>
+            <w:tcW w:w="2898" w:type="dxa"/>
           </w:tcPr>
           <w:p>
             <w:r>
@@ -6530,7 +6571,7 @@
         </w:tc>
         <w:tc>
           <w:tcPr>
-            <w:tcW w:w="1858" w:type="dxa"/>
+            <w:tcW w:w="1440" w:type="dxa"/>
           </w:tcPr>
           <w:p>
             <w:pPr>
@@ -6546,7 +6587,7 @@
         </w:tc>
         <w:tc>
           <w:tcPr>
-            <w:tcW w:w="1861" w:type="dxa"/>
+            <w:tcW w:w="1350" w:type="dxa"/>
           </w:tcPr>
           <w:p>
             <w:pPr>
@@ -6562,7 +6603,7 @@
         </w:tc>
         <w:tc>
           <w:tcPr>
-            <w:tcW w:w="1510" w:type="dxa"/>
+            <w:tcW w:w="1530" w:type="dxa"/>
           </w:tcPr>
           <w:p>
             <w:pPr>
@@ -6578,7 +6619,7 @@
         </w:tc>
         <w:tc>
           <w:tcPr>
-            <w:tcW w:w="2224" w:type="dxa"/>
+            <w:tcW w:w="2404" w:type="dxa"/>
           </w:tcPr>
           <w:p>
             <w:pPr>
@@ -6601,7 +6642,7 @@
         <w:tc>
           <w:tcPr>
             <w:cnfStyle w:val="001000000000" w:firstRow="0" w:lastRow="0" w:firstColumn="1" w:lastColumn="0" w:oddVBand="0" w:evenVBand="0" w:oddHBand="0" w:evenHBand="0" w:firstRowFirstColumn="0" w:firstRowLastColumn="0" w:lastRowFirstColumn="0" w:lastRowLastColumn="0"/>
-            <w:tcW w:w="2169" w:type="dxa"/>
+            <w:tcW w:w="2898" w:type="dxa"/>
             <w:shd w:val="clear" w:color="auto" w:fill="F5F5FA"/>
           </w:tcPr>
           <w:p>
@@ -6615,7 +6656,7 @@
         </w:tc>
         <w:tc>
           <w:tcPr>
-            <w:tcW w:w="1858" w:type="dxa"/>
+            <w:tcW w:w="1440" w:type="dxa"/>
             <w:shd w:val="clear" w:color="auto" w:fill="F5F5FA"/>
           </w:tcPr>
           <w:p>
@@ -6632,7 +6673,7 @@
         </w:tc>
         <w:tc>
           <w:tcPr>
-            <w:tcW w:w="1861" w:type="dxa"/>
+            <w:tcW w:w="1350" w:type="dxa"/>
             <w:shd w:val="clear" w:color="auto" w:fill="F5F5FA"/>
           </w:tcPr>
           <w:p>
@@ -6649,7 +6690,7 @@
         </w:tc>
         <w:tc>
           <w:tcPr>
-            <w:tcW w:w="1510" w:type="dxa"/>
+            <w:tcW w:w="1530" w:type="dxa"/>
             <w:shd w:val="clear" w:color="auto" w:fill="F5F5FA"/>
           </w:tcPr>
           <w:p>
@@ -6666,7 +6707,7 @@
         </w:tc>
         <w:tc>
           <w:tcPr>
-            <w:tcW w:w="2224" w:type="dxa"/>
+            <w:tcW w:w="2404" w:type="dxa"/>
             <w:shd w:val="clear" w:color="auto" w:fill="F5F5FA"/>
           </w:tcPr>
           <w:p>
@@ -6690,7 +6731,7 @@
         <w:tc>
           <w:tcPr>
             <w:cnfStyle w:val="001000000000" w:firstRow="0" w:lastRow="0" w:firstColumn="1" w:lastColumn="0" w:oddVBand="0" w:evenVBand="0" w:oddHBand="0" w:evenHBand="0" w:firstRowFirstColumn="0" w:firstRowLastColumn="0" w:lastRowFirstColumn="0" w:lastRowLastColumn="0"/>
-            <w:tcW w:w="2169" w:type="dxa"/>
+            <w:tcW w:w="2898" w:type="dxa"/>
           </w:tcPr>
           <w:p>
             <w:r>
@@ -6703,7 +6744,7 @@
         </w:tc>
         <w:tc>
           <w:tcPr>
-            <w:tcW w:w="1858" w:type="dxa"/>
+            <w:tcW w:w="1440" w:type="dxa"/>
           </w:tcPr>
           <w:p>
             <w:pPr>
@@ -6719,7 +6760,7 @@
         </w:tc>
         <w:tc>
           <w:tcPr>
-            <w:tcW w:w="1861" w:type="dxa"/>
+            <w:tcW w:w="1350" w:type="dxa"/>
           </w:tcPr>
           <w:p>
             <w:pPr>
@@ -6735,7 +6776,7 @@
         </w:tc>
         <w:tc>
           <w:tcPr>
-            <w:tcW w:w="1510" w:type="dxa"/>
+            <w:tcW w:w="1530" w:type="dxa"/>
           </w:tcPr>
           <w:p>
             <w:pPr>
@@ -6751,7 +6792,7 @@
         </w:tc>
         <w:tc>
           <w:tcPr>
-            <w:tcW w:w="2224" w:type="dxa"/>
+            <w:tcW w:w="2404" w:type="dxa"/>
           </w:tcPr>
           <w:p>
             <w:pPr>
@@ -6774,7 +6815,7 @@
         <w:tc>
           <w:tcPr>
             <w:cnfStyle w:val="001000000000" w:firstRow="0" w:lastRow="0" w:firstColumn="1" w:lastColumn="0" w:oddVBand="0" w:evenVBand="0" w:oddHBand="0" w:evenHBand="0" w:firstRowFirstColumn="0" w:firstRowLastColumn="0" w:lastRowFirstColumn="0" w:lastRowLastColumn="0"/>
-            <w:tcW w:w="2169" w:type="dxa"/>
+            <w:tcW w:w="2898" w:type="dxa"/>
             <w:shd w:val="clear" w:color="auto" w:fill="F5F5FA"/>
           </w:tcPr>
           <w:p>
@@ -6788,7 +6829,7 @@
         </w:tc>
         <w:tc>
           <w:tcPr>
-            <w:tcW w:w="1858" w:type="dxa"/>
+            <w:tcW w:w="1440" w:type="dxa"/>
             <w:shd w:val="clear" w:color="auto" w:fill="F5F5FA"/>
           </w:tcPr>
           <w:p>
@@ -6805,7 +6846,7 @@
         </w:tc>
         <w:tc>
           <w:tcPr>
-            <w:tcW w:w="1861" w:type="dxa"/>
+            <w:tcW w:w="1350" w:type="dxa"/>
             <w:shd w:val="clear" w:color="auto" w:fill="F5F5FA"/>
           </w:tcPr>
           <w:p>
@@ -6822,7 +6863,7 @@
         </w:tc>
         <w:tc>
           <w:tcPr>
-            <w:tcW w:w="1510" w:type="dxa"/>
+            <w:tcW w:w="1530" w:type="dxa"/>
             <w:shd w:val="clear" w:color="auto" w:fill="F5F5FA"/>
           </w:tcPr>
           <w:p>
@@ -6839,7 +6880,7 @@
         </w:tc>
         <w:tc>
           <w:tcPr>
-            <w:tcW w:w="2224" w:type="dxa"/>
+            <w:tcW w:w="2404" w:type="dxa"/>
             <w:shd w:val="clear" w:color="auto" w:fill="F5F5FA"/>
           </w:tcPr>
           <w:p>
@@ -6863,21 +6904,20 @@
         <w:tc>
           <w:tcPr>
             <w:cnfStyle w:val="001000000000" w:firstRow="0" w:lastRow="0" w:firstColumn="1" w:lastColumn="0" w:oddVBand="0" w:evenVBand="0" w:oddHBand="0" w:evenHBand="0" w:firstRowFirstColumn="0" w:firstRowLastColumn="0" w:lastRowFirstColumn="0" w:lastRowLastColumn="0"/>
-            <w:tcW w:w="2169" w:type="dxa"/>
-          </w:tcPr>
-          <w:p>
-            <w:r>
-              <w:rPr>
-                <w:sz w:val="20"/>
-              </w:rPr>
-              <w:lastRenderedPageBreak/>
+            <w:tcW w:w="2898" w:type="dxa"/>
+          </w:tcPr>
+          <w:p>
+            <w:r>
+              <w:rPr>
+                <w:sz w:val="20"/>
+              </w:rPr>
               <w:t>Catalog auto-growth</w:t>
             </w:r>
           </w:p>
         </w:tc>
         <w:tc>
           <w:tcPr>
-            <w:tcW w:w="1858" w:type="dxa"/>
+            <w:tcW w:w="1440" w:type="dxa"/>
           </w:tcPr>
           <w:p>
             <w:pPr>
@@ -6893,7 +6933,7 @@
         </w:tc>
         <w:tc>
           <w:tcPr>
-            <w:tcW w:w="1861" w:type="dxa"/>
+            <w:tcW w:w="1350" w:type="dxa"/>
           </w:tcPr>
           <w:p>
             <w:pPr>
@@ -6909,7 +6949,7 @@
         </w:tc>
         <w:tc>
           <w:tcPr>
-            <w:tcW w:w="1510" w:type="dxa"/>
+            <w:tcW w:w="1530" w:type="dxa"/>
           </w:tcPr>
           <w:p>
             <w:pPr>
@@ -6925,7 +6965,7 @@
         </w:tc>
         <w:tc>
           <w:tcPr>
-            <w:tcW w:w="2224" w:type="dxa"/>
+            <w:tcW w:w="2404" w:type="dxa"/>
           </w:tcPr>
           <w:p>
             <w:pPr>
@@ -6948,7 +6988,7 @@
         <w:tc>
           <w:tcPr>
             <w:cnfStyle w:val="001000000000" w:firstRow="0" w:lastRow="0" w:firstColumn="1" w:lastColumn="0" w:oddVBand="0" w:evenVBand="0" w:oddHBand="0" w:evenHBand="0" w:firstRowFirstColumn="0" w:firstRowLastColumn="0" w:lastRowFirstColumn="0" w:lastRowLastColumn="0"/>
-            <w:tcW w:w="2169" w:type="dxa"/>
+            <w:tcW w:w="2898" w:type="dxa"/>
             <w:shd w:val="clear" w:color="auto" w:fill="F5F5FA"/>
           </w:tcPr>
           <w:p>
@@ -6962,7 +7002,7 @@
         </w:tc>
         <w:tc>
           <w:tcPr>
-            <w:tcW w:w="1858" w:type="dxa"/>
+            <w:tcW w:w="1440" w:type="dxa"/>
             <w:shd w:val="clear" w:color="auto" w:fill="F5F5FA"/>
           </w:tcPr>
           <w:p>
@@ -6979,7 +7019,7 @@
         </w:tc>
         <w:tc>
           <w:tcPr>
-            <w:tcW w:w="1861" w:type="dxa"/>
+            <w:tcW w:w="1350" w:type="dxa"/>
             <w:shd w:val="clear" w:color="auto" w:fill="F5F5FA"/>
           </w:tcPr>
           <w:p>
@@ -6996,7 +7036,7 @@
         </w:tc>
         <w:tc>
           <w:tcPr>
-            <w:tcW w:w="1510" w:type="dxa"/>
+            <w:tcW w:w="1530" w:type="dxa"/>
             <w:shd w:val="clear" w:color="auto" w:fill="F5F5FA"/>
           </w:tcPr>
           <w:p>
@@ -7013,7 +7053,7 @@
         </w:tc>
         <w:tc>
           <w:tcPr>
-            <w:tcW w:w="2224" w:type="dxa"/>
+            <w:tcW w:w="2404" w:type="dxa"/>
             <w:shd w:val="clear" w:color="auto" w:fill="F5F5FA"/>
           </w:tcPr>
           <w:p>
@@ -7037,7 +7077,7 @@
         <w:tc>
           <w:tcPr>
             <w:cnfStyle w:val="001000000000" w:firstRow="0" w:lastRow="0" w:firstColumn="1" w:lastColumn="0" w:oddVBand="0" w:evenVBand="0" w:oddHBand="0" w:evenHBand="0" w:firstRowFirstColumn="0" w:firstRowLastColumn="0" w:lastRowFirstColumn="0" w:lastRowLastColumn="0"/>
-            <w:tcW w:w="2169" w:type="dxa"/>
+            <w:tcW w:w="2898" w:type="dxa"/>
           </w:tcPr>
           <w:p>
             <w:r>
@@ -7050,7 +7090,7 @@
         </w:tc>
         <w:tc>
           <w:tcPr>
-            <w:tcW w:w="1858" w:type="dxa"/>
+            <w:tcW w:w="1440" w:type="dxa"/>
           </w:tcPr>
           <w:p>
             <w:pPr>
@@ -7066,7 +7106,7 @@
         </w:tc>
         <w:tc>
           <w:tcPr>
-            <w:tcW w:w="1861" w:type="dxa"/>
+            <w:tcW w:w="1350" w:type="dxa"/>
           </w:tcPr>
           <w:p>
             <w:pPr>
@@ -7082,7 +7122,7 @@
         </w:tc>
         <w:tc>
           <w:tcPr>
-            <w:tcW w:w="1510" w:type="dxa"/>
+            <w:tcW w:w="1530" w:type="dxa"/>
           </w:tcPr>
           <w:p>
             <w:pPr>
@@ -7098,7 +7138,7 @@
         </w:tc>
         <w:tc>
           <w:tcPr>
-            <w:tcW w:w="2224" w:type="dxa"/>
+            <w:tcW w:w="2404" w:type="dxa"/>
           </w:tcPr>
           <w:p>
             <w:pPr>
@@ -7121,7 +7161,7 @@
         <w:tc>
           <w:tcPr>
             <w:cnfStyle w:val="001000000000" w:firstRow="0" w:lastRow="0" w:firstColumn="1" w:lastColumn="0" w:oddVBand="0" w:evenVBand="0" w:oddHBand="0" w:evenHBand="0" w:firstRowFirstColumn="0" w:firstRowLastColumn="0" w:lastRowFirstColumn="0" w:lastRowLastColumn="0"/>
-            <w:tcW w:w="2169" w:type="dxa"/>
+            <w:tcW w:w="2898" w:type="dxa"/>
             <w:shd w:val="clear" w:color="auto" w:fill="F5F5FA"/>
           </w:tcPr>
           <w:p>
@@ -7135,7 +7175,7 @@
         </w:tc>
         <w:tc>
           <w:tcPr>
-            <w:tcW w:w="1858" w:type="dxa"/>
+            <w:tcW w:w="1440" w:type="dxa"/>
             <w:shd w:val="clear" w:color="auto" w:fill="F5F5FA"/>
           </w:tcPr>
           <w:p>
@@ -7152,7 +7192,7 @@
         </w:tc>
         <w:tc>
           <w:tcPr>
-            <w:tcW w:w="1861" w:type="dxa"/>
+            <w:tcW w:w="1350" w:type="dxa"/>
             <w:shd w:val="clear" w:color="auto" w:fill="F5F5FA"/>
           </w:tcPr>
           <w:p>
@@ -7169,7 +7209,7 @@
         </w:tc>
         <w:tc>
           <w:tcPr>
-            <w:tcW w:w="1510" w:type="dxa"/>
+            <w:tcW w:w="1530" w:type="dxa"/>
             <w:shd w:val="clear" w:color="auto" w:fill="F5F5FA"/>
           </w:tcPr>
           <w:p>
@@ -7186,7 +7226,7 @@
         </w:tc>
         <w:tc>
           <w:tcPr>
-            <w:tcW w:w="2224" w:type="dxa"/>
+            <w:tcW w:w="2404" w:type="dxa"/>
             <w:shd w:val="clear" w:color="auto" w:fill="F5F5FA"/>
           </w:tcPr>
           <w:p>
@@ -7210,7 +7250,7 @@
         <w:tc>
           <w:tcPr>
             <w:cnfStyle w:val="001000000000" w:firstRow="0" w:lastRow="0" w:firstColumn="1" w:lastColumn="0" w:oddVBand="0" w:evenVBand="0" w:oddHBand="0" w:evenHBand="0" w:firstRowFirstColumn="0" w:firstRowLastColumn="0" w:lastRowFirstColumn="0" w:lastRowLastColumn="0"/>
-            <w:tcW w:w="2169" w:type="dxa"/>
+            <w:tcW w:w="2898" w:type="dxa"/>
           </w:tcPr>
           <w:p>
             <w:r>
@@ -7223,7 +7263,7 @@
         </w:tc>
         <w:tc>
           <w:tcPr>
-            <w:tcW w:w="1858" w:type="dxa"/>
+            <w:tcW w:w="1440" w:type="dxa"/>
           </w:tcPr>
           <w:p>
             <w:pPr>
@@ -7239,7 +7279,7 @@
         </w:tc>
         <w:tc>
           <w:tcPr>
-            <w:tcW w:w="1861" w:type="dxa"/>
+            <w:tcW w:w="1350" w:type="dxa"/>
           </w:tcPr>
           <w:p>
             <w:pPr>
@@ -7255,7 +7295,7 @@
         </w:tc>
         <w:tc>
           <w:tcPr>
-            <w:tcW w:w="1510" w:type="dxa"/>
+            <w:tcW w:w="1530" w:type="dxa"/>
           </w:tcPr>
           <w:p>
             <w:pPr>
@@ -7271,7 +7311,7 @@
         </w:tc>
         <w:tc>
           <w:tcPr>
-            <w:tcW w:w="2224" w:type="dxa"/>
+            <w:tcW w:w="2404" w:type="dxa"/>
           </w:tcPr>
           <w:p>
             <w:pPr>
@@ -7294,7 +7334,7 @@
         <w:tc>
           <w:tcPr>
             <w:cnfStyle w:val="001000000000" w:firstRow="0" w:lastRow="0" w:firstColumn="1" w:lastColumn="0" w:oddVBand="0" w:evenVBand="0" w:oddHBand="0" w:evenHBand="0" w:firstRowFirstColumn="0" w:firstRowLastColumn="0" w:lastRowFirstColumn="0" w:lastRowLastColumn="0"/>
-            <w:tcW w:w="2169" w:type="dxa"/>
+            <w:tcW w:w="2898" w:type="dxa"/>
             <w:shd w:val="clear" w:color="auto" w:fill="F5F5FA"/>
           </w:tcPr>
           <w:p>
@@ -7308,7 +7348,7 @@
         </w:tc>
         <w:tc>
           <w:tcPr>
-            <w:tcW w:w="1858" w:type="dxa"/>
+            <w:tcW w:w="1440" w:type="dxa"/>
             <w:shd w:val="clear" w:color="auto" w:fill="F5F5FA"/>
           </w:tcPr>
           <w:p>
@@ -7325,7 +7365,7 @@
         </w:tc>
         <w:tc>
           <w:tcPr>
-            <w:tcW w:w="1861" w:type="dxa"/>
+            <w:tcW w:w="1350" w:type="dxa"/>
             <w:shd w:val="clear" w:color="auto" w:fill="F5F5FA"/>
           </w:tcPr>
           <w:p>
@@ -7342,7 +7382,7 @@
         </w:tc>
         <w:tc>
           <w:tcPr>
-            <w:tcW w:w="1510" w:type="dxa"/>
+            <w:tcW w:w="1530" w:type="dxa"/>
             <w:shd w:val="clear" w:color="auto" w:fill="F5F5FA"/>
           </w:tcPr>
           <w:p>
@@ -7359,7 +7399,7 @@
         </w:tc>
         <w:tc>
           <w:tcPr>
-            <w:tcW w:w="2224" w:type="dxa"/>
+            <w:tcW w:w="2404" w:type="dxa"/>
             <w:shd w:val="clear" w:color="auto" w:fill="F5F5FA"/>
           </w:tcPr>
           <w:p>
@@ -7383,7 +7423,7 @@
         <w:tc>
           <w:tcPr>
             <w:cnfStyle w:val="001000000000" w:firstRow="0" w:lastRow="0" w:firstColumn="1" w:lastColumn="0" w:oddVBand="0" w:evenVBand="0" w:oddHBand="0" w:evenHBand="0" w:firstRowFirstColumn="0" w:firstRowLastColumn="0" w:lastRowFirstColumn="0" w:lastRowLastColumn="0"/>
-            <w:tcW w:w="2169" w:type="dxa"/>
+            <w:tcW w:w="2898" w:type="dxa"/>
           </w:tcPr>
           <w:p>
             <w:r>
@@ -7396,7 +7436,7 @@
         </w:tc>
         <w:tc>
           <w:tcPr>
-            <w:tcW w:w="1858" w:type="dxa"/>
+            <w:tcW w:w="1440" w:type="dxa"/>
           </w:tcPr>
           <w:p>
             <w:pPr>
@@ -7412,7 +7452,7 @@
         </w:tc>
         <w:tc>
           <w:tcPr>
-            <w:tcW w:w="1861" w:type="dxa"/>
+            <w:tcW w:w="1350" w:type="dxa"/>
           </w:tcPr>
           <w:p>
             <w:pPr>
@@ -7428,7 +7468,7 @@
         </w:tc>
         <w:tc>
           <w:tcPr>
-            <w:tcW w:w="1510" w:type="dxa"/>
+            <w:tcW w:w="1530" w:type="dxa"/>
           </w:tcPr>
           <w:p>
             <w:pPr>
@@ -7444,7 +7484,7 @@
         </w:tc>
         <w:tc>
           <w:tcPr>
-            <w:tcW w:w="2224" w:type="dxa"/>
+            <w:tcW w:w="2404" w:type="dxa"/>
           </w:tcPr>
           <w:p>
             <w:pPr>
@@ -7467,7 +7507,7 @@
         <w:tc>
           <w:tcPr>
             <w:cnfStyle w:val="001000000000" w:firstRow="0" w:lastRow="0" w:firstColumn="1" w:lastColumn="0" w:oddVBand="0" w:evenVBand="0" w:oddHBand="0" w:evenHBand="0" w:firstRowFirstColumn="0" w:firstRowLastColumn="0" w:lastRowFirstColumn="0" w:lastRowLastColumn="0"/>
-            <w:tcW w:w="2169" w:type="dxa"/>
+            <w:tcW w:w="2898" w:type="dxa"/>
             <w:shd w:val="clear" w:color="auto" w:fill="F5F5FA"/>
           </w:tcPr>
           <w:p>
@@ -7481,7 +7521,7 @@
         </w:tc>
         <w:tc>
           <w:tcPr>
-            <w:tcW w:w="1858" w:type="dxa"/>
+            <w:tcW w:w="1440" w:type="dxa"/>
             <w:shd w:val="clear" w:color="auto" w:fill="F5F5FA"/>
           </w:tcPr>
           <w:p>
@@ -7498,7 +7538,7 @@
         </w:tc>
         <w:tc>
           <w:tcPr>
-            <w:tcW w:w="1861" w:type="dxa"/>
+            <w:tcW w:w="1350" w:type="dxa"/>
             <w:shd w:val="clear" w:color="auto" w:fill="F5F5FA"/>
           </w:tcPr>
           <w:p>
@@ -7515,7 +7555,7 @@
         </w:tc>
         <w:tc>
           <w:tcPr>
-            <w:tcW w:w="1510" w:type="dxa"/>
+            <w:tcW w:w="1530" w:type="dxa"/>
             <w:shd w:val="clear" w:color="auto" w:fill="F5F5FA"/>
           </w:tcPr>
           <w:p>
@@ -7532,7 +7572,7 @@
         </w:tc>
         <w:tc>
           <w:tcPr>
-            <w:tcW w:w="2224" w:type="dxa"/>
+            <w:tcW w:w="2404" w:type="dxa"/>
             <w:shd w:val="clear" w:color="auto" w:fill="F5F5FA"/>
           </w:tcPr>
           <w:p>
@@ -7556,7 +7596,7 @@
         <w:tc>
           <w:tcPr>
             <w:cnfStyle w:val="001000000000" w:firstRow="0" w:lastRow="0" w:firstColumn="1" w:lastColumn="0" w:oddVBand="0" w:evenVBand="0" w:oddHBand="0" w:evenHBand="0" w:firstRowFirstColumn="0" w:firstRowLastColumn="0" w:lastRowFirstColumn="0" w:lastRowLastColumn="0"/>
-            <w:tcW w:w="2169" w:type="dxa"/>
+            <w:tcW w:w="2898" w:type="dxa"/>
           </w:tcPr>
           <w:p>
             <w:r>
@@ -7569,7 +7609,7 @@
         </w:tc>
         <w:tc>
           <w:tcPr>
-            <w:tcW w:w="1858" w:type="dxa"/>
+            <w:tcW w:w="1440" w:type="dxa"/>
           </w:tcPr>
           <w:p>
             <w:pPr>
@@ -7585,7 +7625,7 @@
         </w:tc>
         <w:tc>
           <w:tcPr>
-            <w:tcW w:w="1861" w:type="dxa"/>
+            <w:tcW w:w="1350" w:type="dxa"/>
           </w:tcPr>
           <w:p>
             <w:pPr>
@@ -7601,7 +7641,7 @@
         </w:tc>
         <w:tc>
           <w:tcPr>
-            <w:tcW w:w="1510" w:type="dxa"/>
+            <w:tcW w:w="1530" w:type="dxa"/>
           </w:tcPr>
           <w:p>
             <w:pPr>
@@ -7617,7 +7657,7 @@
         </w:tc>
         <w:tc>
           <w:tcPr>
-            <w:tcW w:w="2224" w:type="dxa"/>
+            <w:tcW w:w="2404" w:type="dxa"/>
           </w:tcPr>
           <w:p>
             <w:pPr>
@@ -7640,7 +7680,7 @@
         <w:tc>
           <w:tcPr>
             <w:cnfStyle w:val="001000000000" w:firstRow="0" w:lastRow="0" w:firstColumn="1" w:lastColumn="0" w:oddVBand="0" w:evenVBand="0" w:oddHBand="0" w:evenHBand="0" w:firstRowFirstColumn="0" w:firstRowLastColumn="0" w:lastRowFirstColumn="0" w:lastRowLastColumn="0"/>
-            <w:tcW w:w="2169" w:type="dxa"/>
+            <w:tcW w:w="2898" w:type="dxa"/>
             <w:shd w:val="clear" w:color="auto" w:fill="F5F5FA"/>
           </w:tcPr>
           <w:p>
@@ -7654,7 +7694,7 @@
         </w:tc>
         <w:tc>
           <w:tcPr>
-            <w:tcW w:w="1858" w:type="dxa"/>
+            <w:tcW w:w="1440" w:type="dxa"/>
             <w:shd w:val="clear" w:color="auto" w:fill="F5F5FA"/>
           </w:tcPr>
           <w:p>
@@ -7671,7 +7711,7 @@
         </w:tc>
         <w:tc>
           <w:tcPr>
-            <w:tcW w:w="1861" w:type="dxa"/>
+            <w:tcW w:w="1350" w:type="dxa"/>
             <w:shd w:val="clear" w:color="auto" w:fill="F5F5FA"/>
           </w:tcPr>
           <w:p>
@@ -7688,7 +7728,7 @@
         </w:tc>
         <w:tc>
           <w:tcPr>
-            <w:tcW w:w="1510" w:type="dxa"/>
+            <w:tcW w:w="1530" w:type="dxa"/>
             <w:shd w:val="clear" w:color="auto" w:fill="F5F5FA"/>
           </w:tcPr>
           <w:p>
@@ -7705,7 +7745,7 @@
         </w:tc>
         <w:tc>
           <w:tcPr>
-            <w:tcW w:w="2224" w:type="dxa"/>
+            <w:tcW w:w="2404" w:type="dxa"/>
             <w:shd w:val="clear" w:color="auto" w:fill="F5F5FA"/>
           </w:tcPr>
           <w:p>
@@ -7729,7 +7769,7 @@
         <w:tc>
           <w:tcPr>
             <w:cnfStyle w:val="001000000000" w:firstRow="0" w:lastRow="0" w:firstColumn="1" w:lastColumn="0" w:oddVBand="0" w:evenVBand="0" w:oddHBand="0" w:evenHBand="0" w:firstRowFirstColumn="0" w:firstRowLastColumn="0" w:lastRowFirstColumn="0" w:lastRowLastColumn="0"/>
-            <w:tcW w:w="2169" w:type="dxa"/>
+            <w:tcW w:w="2898" w:type="dxa"/>
           </w:tcPr>
           <w:p>
             <w:r>
@@ -7742,7 +7782,7 @@
         </w:tc>
         <w:tc>
           <w:tcPr>
-            <w:tcW w:w="1858" w:type="dxa"/>
+            <w:tcW w:w="1440" w:type="dxa"/>
           </w:tcPr>
           <w:p>
             <w:pPr>
@@ -7758,7 +7798,7 @@
         </w:tc>
         <w:tc>
           <w:tcPr>
-            <w:tcW w:w="1861" w:type="dxa"/>
+            <w:tcW w:w="1350" w:type="dxa"/>
           </w:tcPr>
           <w:p>
             <w:pPr>
@@ -7774,7 +7814,7 @@
         </w:tc>
         <w:tc>
           <w:tcPr>
-            <w:tcW w:w="1510" w:type="dxa"/>
+            <w:tcW w:w="1530" w:type="dxa"/>
           </w:tcPr>
           <w:p>
             <w:pPr>
@@ -7790,7 +7830,7 @@
         </w:tc>
         <w:tc>
           <w:tcPr>
-            <w:tcW w:w="2224" w:type="dxa"/>
+            <w:tcW w:w="2404" w:type="dxa"/>
           </w:tcPr>
           <w:p>
             <w:pPr>
@@ -7813,7 +7853,7 @@
         <w:tc>
           <w:tcPr>
             <w:cnfStyle w:val="001000000000" w:firstRow="0" w:lastRow="0" w:firstColumn="1" w:lastColumn="0" w:oddVBand="0" w:evenVBand="0" w:oddHBand="0" w:evenHBand="0" w:firstRowFirstColumn="0" w:firstRowLastColumn="0" w:lastRowFirstColumn="0" w:lastRowLastColumn="0"/>
-            <w:tcW w:w="2169" w:type="dxa"/>
+            <w:tcW w:w="2898" w:type="dxa"/>
             <w:shd w:val="clear" w:color="auto" w:fill="F5F5FA"/>
           </w:tcPr>
           <w:p>
@@ -7827,7 +7867,7 @@
         </w:tc>
         <w:tc>
           <w:tcPr>
-            <w:tcW w:w="1858" w:type="dxa"/>
+            <w:tcW w:w="1440" w:type="dxa"/>
             <w:shd w:val="clear" w:color="auto" w:fill="F5F5FA"/>
           </w:tcPr>
           <w:p>
@@ -7844,7 +7884,7 @@
         </w:tc>
         <w:tc>
           <w:tcPr>
-            <w:tcW w:w="1861" w:type="dxa"/>
+            <w:tcW w:w="1350" w:type="dxa"/>
             <w:shd w:val="clear" w:color="auto" w:fill="F5F5FA"/>
           </w:tcPr>
           <w:p>
@@ -7861,7 +7901,7 @@
         </w:tc>
         <w:tc>
           <w:tcPr>
-            <w:tcW w:w="1510" w:type="dxa"/>
+            <w:tcW w:w="1530" w:type="dxa"/>
             <w:shd w:val="clear" w:color="auto" w:fill="F5F5FA"/>
           </w:tcPr>
           <w:p>
@@ -7878,7 +7918,7 @@
         </w:tc>
         <w:tc>
           <w:tcPr>
-            <w:tcW w:w="2224" w:type="dxa"/>
+            <w:tcW w:w="2404" w:type="dxa"/>
             <w:shd w:val="clear" w:color="auto" w:fill="F5F5FA"/>
           </w:tcPr>
           <w:p>
@@ -7902,6 +7942,7 @@
       </w:pPr>
       <w:bookmarkStart w:id="20" w:name="_Toc229439183"/>
       <w:r>
+        <w:lastRenderedPageBreak/>
         <w:t>4. MVP Framework Requirements</w:t>
       </w:r>
       <w:bookmarkEnd w:id="20"/>
@@ -8185,14 +8226,7 @@
               <w:rPr>
                 <w:sz w:val="20"/>
               </w:rPr>
-              <w:t xml:space="preserve">An agent-level property that caps LLM turns per user request. When reached, the </w:t>
-            </w:r>
-            <w:r>
-              <w:rPr>
-                <w:sz w:val="20"/>
-              </w:rPr>
-              <w:lastRenderedPageBreak/>
-              <w:t>agent stops and returns what it has.</w:t>
+              <w:t>An agent-level property that caps LLM turns per user request. When reached, the agent stops and returns what it has.</w:t>
             </w:r>
           </w:p>
         </w:tc>
@@ -8209,15 +8243,7 @@
               <w:rPr>
                 <w:sz w:val="20"/>
               </w:rPr>
-              <w:lastRenderedPageBreak/>
-              <w:t xml:space="preserve">UC1 involves 5-10 tool calls. Without a ceiling a confused LLM can loop </w:t>
-            </w:r>
-            <w:r>
-              <w:rPr>
-                <w:sz w:val="20"/>
-              </w:rPr>
-              <w:lastRenderedPageBreak/>
-              <w:t>indefinitely, consuming tokens and blocking the user.</w:t>
+              <w:t>UC1 involves 5-10 tool calls. Without a ceiling a confused LLM can loop indefinitely, consuming tokens and blocking the user.</w:t>
             </w:r>
           </w:p>
         </w:tc>
@@ -8493,7 +8519,11 @@
     </w:p>
     <w:p>
       <w:r>
-        <w:t>The %AI.Tool class (Framework, exists) auto-discovers public ClassMethods and exposes them as tools. The following metadata properties are needed on every tool for orchestration, UI, and security. Properties marked Framework (exists) are already available; Framework (proposed) are new requirements.</w:t>
+        <w:t xml:space="preserve">The %AI.Tool class (Framework, exists) auto-discovers public ClassMethods and exposes them as tools. The following metadata properties are needed on every tool for orchestration, UI, and security. </w:t>
+      </w:r>
+      <w:r>
+        <w:lastRenderedPageBreak/>
+        <w:t>Properties marked Framework (exists) are already available; Framework (proposed) are new requirements.</w:t>
       </w:r>
     </w:p>
     <w:tbl>
@@ -8840,14 +8870,7 @@
               <w:rPr>
                 <w:sz w:val="20"/>
               </w:rPr>
-              <w:t xml:space="preserve">ObjectScript parameter signature. The </w:t>
-            </w:r>
-            <w:r>
-              <w:rPr>
-                <w:sz w:val="20"/>
-              </w:rPr>
-              <w:lastRenderedPageBreak/>
-              <w:t>framework auto-generates a JSON Schema from this at compile time.</w:t>
+              <w:t>ObjectScript parameter signature. The framework auto-generates a JSON Schema from this at compile time.</w:t>
             </w:r>
           </w:p>
         </w:tc>
@@ -8863,15 +8886,7 @@
               <w:rPr>
                 <w:sz w:val="20"/>
               </w:rPr>
-              <w:lastRenderedPageBreak/>
-              <w:t xml:space="preserve">Tool authors do not hand-write JSON </w:t>
-            </w:r>
-            <w:r>
-              <w:rPr>
-                <w:sz w:val="20"/>
-              </w:rPr>
-              <w:lastRenderedPageBreak/>
-              <w:t>Schemas.</w:t>
+              <w:t>Tool authors do not hand-write JSON Schemas.</w:t>
             </w:r>
           </w:p>
         </w:tc>
@@ -9201,7 +9216,14 @@
               <w:rPr>
                 <w:sz w:val="20"/>
               </w:rPr>
-              <w:t>Maximum wall-clock seconds before the orchestrator cancels the tool.</w:t>
+              <w:t xml:space="preserve">Maximum wall-clock seconds before the orchestrator cancels </w:t>
+            </w:r>
+            <w:r>
+              <w:rPr>
+                <w:sz w:val="20"/>
+              </w:rPr>
+              <w:lastRenderedPageBreak/>
+              <w:t>the tool.</w:t>
             </w:r>
           </w:p>
         </w:tc>
@@ -9217,7 +9239,15 @@
               <w:rPr>
                 <w:sz w:val="20"/>
               </w:rPr>
-              <w:t>Different tools have different durations: catalog search finishes in 1 second; compiling a production may take 30. A stuck tool must not block the entire agent turn.</w:t>
+              <w:lastRenderedPageBreak/>
+              <w:t xml:space="preserve">Different tools have different durations: catalog search finishes in 1 second; </w:t>
+            </w:r>
+            <w:r>
+              <w:rPr>
+                <w:sz w:val="20"/>
+              </w:rPr>
+              <w:lastRenderedPageBreak/>
+              <w:t>compiling a production may take 30. A stuck tool must not block the entire agent turn.</w:t>
             </w:r>
           </w:p>
         </w:tc>
@@ -9238,6 +9268,7 @@
               <w:rPr>
                 <w:sz w:val="20"/>
               </w:rPr>
+              <w:lastRenderedPageBreak/>
               <w:t>Idempotent</w:t>
             </w:r>
           </w:p>
@@ -9326,7 +9357,6 @@
               <w:rPr>
                 <w:sz w:val="20"/>
               </w:rPr>
-              <w:lastRenderedPageBreak/>
               <w:t>Category</w:t>
             </w:r>
           </w:p>
@@ -9961,6 +9991,7 @@
               <w:rPr>
                 <w:sz w:val="20"/>
               </w:rPr>
+              <w:lastRenderedPageBreak/>
               <w:t>Cancelled</w:t>
             </w:r>
           </w:p>
@@ -10008,7 +10039,6 @@
       </w:pPr>
       <w:bookmarkStart w:id="24" w:name="_Toc229439187"/>
       <w:r>
-        <w:lastRenderedPageBreak/>
         <w:t>4.4 Skill Sub-Agents</w:t>
       </w:r>
       <w:bookmarkEnd w:id="24"/>
@@ -10498,6 +10528,7 @@
               <w:rPr>
                 <w:sz w:val="20"/>
               </w:rPr>
+              <w:lastRenderedPageBreak/>
               <w:t>BPL</w:t>
             </w:r>
           </w:p>
@@ -10530,14 +10561,7 @@
               <w:rPr>
                 <w:sz w:val="20"/>
               </w:rPr>
-              <w:t xml:space="preserve">BPL activities (assign, call, code, transform, rule), </w:t>
-            </w:r>
-            <w:r>
-              <w:rPr>
-                <w:sz w:val="20"/>
-              </w:rPr>
-              <w:lastRenderedPageBreak/>
-              <w:t>compensation handlers, async patterns.</w:t>
+              <w:t>BPL activities (assign, call, code, transform, rule), compensation handlers, async patterns.</w:t>
             </w:r>
           </w:p>
         </w:tc>
@@ -11822,14 +11846,7 @@
               <w:rPr>
                 <w:sz w:val="20"/>
               </w:rPr>
-              <w:t xml:space="preserve">Which users may converse with this </w:t>
-            </w:r>
-            <w:r>
-              <w:rPr>
-                <w:sz w:val="20"/>
-              </w:rPr>
-              <w:lastRenderedPageBreak/>
-              <w:t>agent.</w:t>
+              <w:t>Which users may converse with this agent.</w:t>
             </w:r>
           </w:p>
         </w:tc>
@@ -11845,7 +11862,6 @@
               <w:rPr>
                 <w:sz w:val="20"/>
               </w:rPr>
-              <w:lastRenderedPageBreak/>
               <w:t>Framework (proposed)</w:t>
             </w:r>
           </w:p>
@@ -11884,7 +11900,14 @@
               <w:rPr>
                 <w:sz w:val="20"/>
               </w:rPr>
-              <w:t>Caller authentication and namespace validation at the server boundary.</w:t>
+              <w:t xml:space="preserve">Caller authentication and namespace validation at the server </w:t>
+            </w:r>
+            <w:r>
+              <w:rPr>
+                <w:sz w:val="20"/>
+              </w:rPr>
+              <w:lastRenderedPageBreak/>
+              <w:t>boundary.</w:t>
             </w:r>
           </w:p>
         </w:tc>
@@ -11901,6 +11924,7 @@
               <w:rPr>
                 <w:sz w:val="20"/>
               </w:rPr>
+              <w:lastRenderedPageBreak/>
               <w:t>Framework (exists via %CSP.REST authentication)</w:t>
             </w:r>
           </w:p>
@@ -12415,7 +12439,6 @@
       </w:pPr>
       <w:bookmarkStart w:id="32" w:name="_Toc229439195"/>
       <w:r>
-        <w:lastRenderedPageBreak/>
         <w:t>4.9 Error Contract</w:t>
       </w:r>
       <w:bookmarkEnd w:id="32"/>
@@ -12454,6 +12477,7 @@
                 <w:color w:val="FFFFFF"/>
                 <w:sz w:val="20"/>
               </w:rPr>
+              <w:lastRenderedPageBreak/>
               <w:t>Field</w:t>
             </w:r>
           </w:p>
@@ -13142,14 +13166,7 @@
               <w:rPr>
                 <w:sz w:val="20"/>
               </w:rPr>
-              <w:t xml:space="preserve">Provider </w:t>
-            </w:r>
-            <w:r>
-              <w:rPr>
-                <w:sz w:val="20"/>
-              </w:rPr>
-              <w:lastRenderedPageBreak/>
-              <w:t>configuration</w:t>
+              <w:t>Provider configuration</w:t>
             </w:r>
           </w:p>
         </w:tc>
@@ -13165,15 +13182,7 @@
               <w:rPr>
                 <w:sz w:val="20"/>
               </w:rPr>
-              <w:lastRenderedPageBreak/>
-              <w:t xml:space="preserve">Configure LLM connections. Paste API keys (stored in IRIS Secure Wallet via </w:t>
-            </w:r>
-            <w:r>
-              <w:rPr>
-                <w:sz w:val="20"/>
-              </w:rPr>
-              <w:lastRenderedPageBreak/>
-              <w:t>%AI.Utils.WalletStore, never in plaintext). Click Test. See green/red status.</w:t>
+              <w:t>Configure LLM connections. Paste API keys (stored in IRIS Secure Wallet via %AI.Utils.WalletStore, never in plaintext). Click Test. See green/red status.</w:t>
             </w:r>
           </w:p>
         </w:tc>
@@ -13189,7 +13198,6 @@
               <w:rPr>
                 <w:sz w:val="20"/>
               </w:rPr>
-              <w:lastRenderedPageBreak/>
               <w:t>All UCs</w:t>
             </w:r>
           </w:p>
@@ -13281,7 +13289,14 @@
               <w:rPr>
                 <w:sz w:val="20"/>
               </w:rPr>
-              <w:t>View audit trail: tools called, arguments, results, duration, user, namespace.</w:t>
+              <w:t xml:space="preserve">View audit trail: tools called, arguments, results, </w:t>
+            </w:r>
+            <w:r>
+              <w:rPr>
+                <w:sz w:val="20"/>
+              </w:rPr>
+              <w:lastRenderedPageBreak/>
+              <w:t>duration, user, namespace.</w:t>
             </w:r>
           </w:p>
         </w:tc>
@@ -13297,6 +13312,7 @@
               <w:rPr>
                 <w:sz w:val="20"/>
               </w:rPr>
+              <w:lastRenderedPageBreak/>
               <w:t>All UCs</w:t>
             </w:r>
           </w:p>
@@ -13886,14 +13902,7 @@
               <w:rPr>
                 <w:sz w:val="20"/>
               </w:rPr>
-              <w:t xml:space="preserve">Plan + approve + build + test must complete within LLM provider rate </w:t>
-            </w:r>
-            <w:r>
-              <w:rPr>
-                <w:sz w:val="20"/>
-              </w:rPr>
-              <w:lastRenderedPageBreak/>
-              <w:t>limits.</w:t>
+              <w:t>Plan + approve + build + test must complete within LLM provider rate limits.</w:t>
             </w:r>
           </w:p>
         </w:tc>
@@ -14173,7 +14182,14 @@
               <w:rPr>
                 <w:sz w:val="20"/>
               </w:rPr>
-              <w:t>Each session is independent. Process pool must handle load.</w:t>
+              <w:t xml:space="preserve">Each session is independent. Process </w:t>
+            </w:r>
+            <w:r>
+              <w:rPr>
+                <w:sz w:val="20"/>
+              </w:rPr>
+              <w:lastRenderedPageBreak/>
+              <w:t>pool must handle load.</w:t>
             </w:r>
           </w:p>
         </w:tc>
@@ -14576,14 +14592,7 @@
               <w:rPr>
                 <w:sz w:val="20"/>
               </w:rPr>
-              <w:t xml:space="preserve">No iteration limit / </w:t>
-            </w:r>
-            <w:r>
-              <w:rPr>
-                <w:sz w:val="20"/>
-              </w:rPr>
-              <w:lastRenderedPageBreak/>
-              <w:t>token budget</w:t>
+              <w:t>No iteration limit / token budget</w:t>
             </w:r>
           </w:p>
         </w:tc>
@@ -14600,7 +14609,6 @@
               <w:rPr>
                 <w:sz w:val="20"/>
               </w:rPr>
-              <w:lastRenderedPageBreak/>
               <w:t>New feature</w:t>
             </w:r>
           </w:p>
@@ -14635,14 +14643,7 @@
               <w:rPr>
                 <w:sz w:val="20"/>
               </w:rPr>
-              <w:t xml:space="preserve">AgenticInterop.Agent.Monitor </w:t>
-            </w:r>
-            <w:r>
-              <w:rPr>
-                <w:sz w:val="20"/>
-              </w:rPr>
-              <w:lastRenderedPageBreak/>
-              <w:t>wraps agent.Run() with a 60-second deadline and 50,000-token budget, killing the process if exceeded.</w:t>
+              <w:t>AgenticInterop.Agent.Monitor wraps agent.Run() with a 60-second deadline and 50,000-token budget, killing the process if exceeded.</w:t>
             </w:r>
           </w:p>
         </w:tc>
@@ -14659,15 +14660,7 @@
               <w:rPr>
                 <w:sz w:val="20"/>
               </w:rPr>
-              <w:lastRenderedPageBreak/>
-              <w:t xml:space="preserve">Add MaxIterations and </w:t>
-            </w:r>
-            <w:r>
-              <w:rPr>
-                <w:sz w:val="20"/>
-              </w:rPr>
-              <w:lastRenderedPageBreak/>
-              <w:t>TokenBudget as %AI.Agent properties with graceful stop behavior.</w:t>
+              <w:t>Add MaxIterations and TokenBudget as %AI.Agent properties with graceful stop behavior.</w:t>
             </w:r>
           </w:p>
         </w:tc>
@@ -14852,6 +14845,7 @@
         <w:spacing w:after="200"/>
       </w:pPr>
       <w:r>
+        <w:lastRenderedPageBreak/>
         <w:br w:type="page"/>
       </w:r>
     </w:p>
@@ -16293,7 +16287,6 @@
               <w:rPr>
                 <w:sz w:val="20"/>
               </w:rPr>
-              <w:lastRenderedPageBreak/>
               <w:t>RAG</w:t>
             </w:r>
           </w:p>
@@ -16455,6 +16448,7 @@
               <w:rPr>
                 <w:sz w:val="20"/>
               </w:rPr>
+              <w:lastRenderedPageBreak/>
               <w:t>Settings</w:t>
             </w:r>
           </w:p>
@@ -17291,7 +17285,6 @@
               <w:rPr>
                 <w:sz w:val="20"/>
               </w:rPr>
-              <w:lastRenderedPageBreak/>
               <w:t>Skill priority and conflict resolution</w:t>
             </w:r>
           </w:p>
@@ -17399,7 +17392,14 @@
               <w:rPr>
                 <w:sz w:val="20"/>
               </w:rPr>
-              <w:t>Conversation search and history UI</w:t>
+              <w:t xml:space="preserve">Conversation search and history </w:t>
+            </w:r>
+            <w:r>
+              <w:rPr>
+                <w:sz w:val="20"/>
+              </w:rPr>
+              <w:lastRenderedPageBreak/>
+              <w:t>UI</w:t>
             </w:r>
           </w:p>
         </w:tc>
@@ -17415,6 +17415,7 @@
               <w:rPr>
                 <w:sz w:val="20"/>
               </w:rPr>
+              <w:lastRenderedPageBreak/>
               <w:t>Queryable index of past conversations. Search by title, content, and date.</w:t>
             </w:r>
           </w:p>
@@ -17431,7 +17432,14 @@
               <w:rPr>
                 <w:sz w:val="20"/>
               </w:rPr>
-              <w:t>MVP works with basic session list. History search improves the experience for heavy users.</w:t>
+              <w:t xml:space="preserve">MVP works with basic session list. History search improves the </w:t>
+            </w:r>
+            <w:r>
+              <w:rPr>
+                <w:sz w:val="20"/>
+              </w:rPr>
+              <w:lastRenderedPageBreak/>
+              <w:t>experience for heavy users.</w:t>
             </w:r>
           </w:p>
         </w:tc>
@@ -17452,6 +17460,7 @@
               <w:rPr>
                 <w:sz w:val="20"/>
               </w:rPr>
+              <w:lastRenderedPageBreak/>
               <w:t>Conversation export</w:t>
             </w:r>
           </w:p>
@@ -17961,7 +17970,6 @@
               <w:rPr>
                 <w:sz w:val="20"/>
               </w:rPr>
-              <w:lastRenderedPageBreak/>
               <w:t>ToolSets (%AI.ToolSet)</w:t>
             </w:r>
           </w:p>
@@ -18140,6 +18148,7 @@
       </w:pPr>
       <w:bookmarkStart w:id="42" w:name="_Toc229439205"/>
       <w:r>
+        <w:lastRenderedPageBreak/>
         <w:t>C.2 Tools by Domain</w:t>
       </w:r>
       <w:bookmarkEnd w:id="42"/>
@@ -19299,6 +19308,7 @@
               <w:rPr>
                 <w:sz w:val="20"/>
               </w:rPr>
+              <w:lastRenderedPageBreak/>
               <w:t>AgenticInterop.Policy.ToolFilter</w:t>
             </w:r>
           </w:p>
@@ -19838,7 +19848,6 @@
               <w:rPr>
                 <w:sz w:val="20"/>
               </w:rPr>
-              <w:lastRenderedPageBreak/>
               <w:t>DTL</w:t>
             </w:r>
           </w:p>
@@ -20172,6 +20181,7 @@
               <w:rPr>
                 <w:sz w:val="20"/>
               </w:rPr>
+              <w:lastRenderedPageBreak/>
               <w:t>FastEmbed</w:t>
             </w:r>
           </w:p>
@@ -20197,34 +20207,111 @@
     </w:tbl>
     <w:p/>
     <w:p/>
-    <w:p>
-      <w:pPr>
-        <w:jc w:val="center"/>
-      </w:pPr>
-      <w:r>
-        <w:rPr>
-          <w:color w:val="999999"/>
-          <w:sz w:val="18"/>
-        </w:rPr>
-        <w:t>Health Interoperability Agentic Framework - Product Requirements Specification - May 2026</w:t>
-      </w:r>
-      <w:r>
-        <w:rPr>
-          <w:color w:val="999999"/>
-          <w:sz w:val="18"/>
-        </w:rPr>
-        <w:br/>
-        <w:t>Review document: DF_Agentic_Interop_AI_Executive_Briefing.pptx</w:t>
-      </w:r>
-    </w:p>
     <w:sectPr>
+      <w:footerReference w:type="default" r:id="rId8"/>
       <w:pgSz w:w="12240" w:h="15840"/>
-      <w:pgMar w:top="1134" w:right="1417" w:bottom="1134" w:left="1417" w:header="720" w:footer="720" w:gutter="0"/>
+      <w:pgMar w:top="1134" w:right="1417" w:bottom="1134" w:left="1417" w:header="720" w:footer="0" w:gutter="0"/>
       <w:cols w:space="720"/>
       <w:docGrid w:linePitch="360"/>
     </w:sectPr>
   </w:body>
 </w:document>
+</file>
+
+<file path=word/endnotes.xml><?xml version="1.0" encoding="utf-8"?>
+<w:endnotes xmlns:wpc="http://schemas.microsoft.com/office/word/2010/wordprocessingCanvas" xmlns:cx="http://schemas.microsoft.com/office/drawing/2014/chartex" xmlns:cx1="http://schemas.microsoft.com/office/drawing/2015/9/8/chartex" xmlns:cx2="http://schemas.microsoft.com/office/drawing/2015/10/21/chartex" xmlns:cx3="http://schemas.microsoft.com/office/drawing/2016/5/9/chartex" xmlns:cx4="http://schemas.microsoft.com/office/drawing/2016/5/10/chartex" xmlns:cx5="http://schemas.microsoft.com/office/drawing/2016/5/11/chartex" xmlns:cx6="http://schemas.microsoft.com/office/drawing/2016/5/12/chartex" xmlns:cx7="http://schemas.microsoft.com/office/drawing/2016/5/13/chartex" xmlns:cx8="http://schemas.microsoft.com/office/drawing/2016/5/14/chartex" xmlns:mc="http://schemas.openxmlformats.org/markup-compatibility/2006" xmlns:aink="http://schemas.microsoft.com/office/drawing/2016/ink" xmlns:am3d="http://schemas.microsoft.com/office/drawing/2017/model3d" xmlns:o="urn:schemas-microsoft-com:office:office" xmlns:oel="http://schemas.microsoft.com/office/2019/extlst" xmlns:r="http://schemas.openxmlformats.org/officeDocument/2006/relationships" xmlns:m="http://schemas.openxmlformats.org/officeDocument/2006/math" xmlns:v="urn:schemas-microsoft-com:vml" xmlns:wp14="http://schemas.microsoft.com/office/word/2010/wordprocessingDrawing" xmlns:wp="http://schemas.openxmlformats.org/drawingml/2006/wordprocessingDrawing" xmlns:w10="urn:schemas-microsoft-com:office:word" xmlns:w="http://schemas.openxmlformats.org/wordprocessingml/2006/main" xmlns:w14="http://schemas.microsoft.com/office/word/2010/wordml" xmlns:w15="http://schemas.microsoft.com/office/word/2012/wordml" xmlns:w16cex="http://schemas.microsoft.com/office/word/2018/wordml/cex" xmlns:w16cid="http://schemas.microsoft.com/office/word/2016/wordml/cid" xmlns:w16="http://schemas.microsoft.com/office/word/2018/wordml" xmlns:w16du="http://schemas.microsoft.com/office/word/2023/wordml/word16du" xmlns:w16sdtdh="http://schemas.microsoft.com/office/word/2020/wordml/sdtdatahash" xmlns:w16sdtfl="http://schemas.microsoft.com/office/word/2024/wordml/sdtformatlock" xmlns:w16se="http://schemas.microsoft.com/office/word/2015/wordml/symex" xmlns:wpg="http://schemas.microsoft.com/office/word/2010/wordprocessingGroup" xmlns:wpi="http://schemas.microsoft.com/office/word/2010/wordprocessingInk" xmlns:wne="http://schemas.microsoft.com/office/word/2006/wordml" xmlns:wps="http://schemas.microsoft.com/office/word/2010/wordprocessingShape" mc:Ignorable="w14 w15 w16se w16cid w16 w16cex w16sdtdh w16sdtfl w16du wp14">
+  <w:endnote w:type="separator" w:id="-1">
+    <w:p>
+      <w:pPr>
+        <w:spacing w:after="0" w:line="240" w:lineRule="auto"/>
+      </w:pPr>
+      <w:r>
+        <w:separator/>
+      </w:r>
+    </w:p>
+  </w:endnote>
+  <w:endnote w:type="continuationSeparator" w:id="0">
+    <w:p>
+      <w:pPr>
+        <w:spacing w:after="0" w:line="240" w:lineRule="auto"/>
+      </w:pPr>
+      <w:r>
+        <w:continuationSeparator/>
+      </w:r>
+    </w:p>
+  </w:endnote>
+</w:endnotes>
+</file>
+
+<file path=word/footer1.xml><?xml version="1.0" encoding="utf-8"?>
+<w:ftr xmlns:wpc="http://schemas.microsoft.com/office/word/2010/wordprocessingCanvas" xmlns:cx="http://schemas.microsoft.com/office/drawing/2014/chartex" xmlns:cx1="http://schemas.microsoft.com/office/drawing/2015/9/8/chartex" xmlns:cx2="http://schemas.microsoft.com/office/drawing/2015/10/21/chartex" xmlns:cx3="http://schemas.microsoft.com/office/drawing/2016/5/9/chartex" xmlns:cx4="http://schemas.microsoft.com/office/drawing/2016/5/10/chartex" xmlns:cx5="http://schemas.microsoft.com/office/drawing/2016/5/11/chartex" xmlns:cx6="http://schemas.microsoft.com/office/drawing/2016/5/12/chartex" xmlns:cx7="http://schemas.microsoft.com/office/drawing/2016/5/13/chartex" xmlns:cx8="http://schemas.microsoft.com/office/drawing/2016/5/14/chartex" xmlns:mc="http://schemas.openxmlformats.org/markup-compatibility/2006" xmlns:aink="http://schemas.microsoft.com/office/drawing/2016/ink" xmlns:am3d="http://schemas.microsoft.com/office/drawing/2017/model3d" xmlns:o="urn:schemas-microsoft-com:office:office" xmlns:oel="http://schemas.microsoft.com/office/2019/extlst" xmlns:r="http://schemas.openxmlformats.org/officeDocument/2006/relationships" xmlns:m="http://schemas.openxmlformats.org/officeDocument/2006/math" xmlns:v="urn:schemas-microsoft-com:vml" xmlns:wp14="http://schemas.microsoft.com/office/word/2010/wordprocessingDrawing" xmlns:wp="http://schemas.openxmlformats.org/drawingml/2006/wordprocessingDrawing" xmlns:w10="urn:schemas-microsoft-com:office:word" xmlns:w="http://schemas.openxmlformats.org/wordprocessingml/2006/main" xmlns:w14="http://schemas.microsoft.com/office/word/2010/wordml" xmlns:w15="http://schemas.microsoft.com/office/word/2012/wordml" xmlns:w16cex="http://schemas.microsoft.com/office/word/2018/wordml/cex" xmlns:w16cid="http://schemas.microsoft.com/office/word/2016/wordml/cid" xmlns:w16="http://schemas.microsoft.com/office/word/2018/wordml" xmlns:w16du="http://schemas.microsoft.com/office/word/2023/wordml/word16du" xmlns:w16sdtdh="http://schemas.microsoft.com/office/word/2020/wordml/sdtdatahash" xmlns:w16sdtfl="http://schemas.microsoft.com/office/word/2024/wordml/sdtformatlock" xmlns:w16se="http://schemas.microsoft.com/office/word/2015/wordml/symex" xmlns:wpg="http://schemas.microsoft.com/office/word/2010/wordprocessingGroup" xmlns:wpi="http://schemas.microsoft.com/office/word/2010/wordprocessingInk" xmlns:wne="http://schemas.microsoft.com/office/word/2006/wordml" xmlns:wps="http://schemas.microsoft.com/office/word/2010/wordprocessingShape" mc:Ignorable="w14 w15 w16se w16cid w16 w16cex w16sdtdh w16sdtfl w16du wp14">
+  <w:p>
+    <w:pPr>
+      <w:jc w:val="center"/>
+      <w:rPr>
+        <w:color w:val="999999"/>
+        <w:sz w:val="18"/>
+      </w:rPr>
+    </w:pPr>
+    <w:r>
+      <w:rPr>
+        <w:color w:val="999999"/>
+        <w:sz w:val="18"/>
+      </w:rPr>
+      <w:t>Health Interoperability Agentic Framework - Product Requirements Specification - May 2026</w:t>
+    </w:r>
+    <w:r>
+      <w:rPr>
+        <w:color w:val="999999"/>
+        <w:sz w:val="18"/>
+      </w:rPr>
+      <w:br/>
+      <w:t>Review document: DF_Agentic_Interop_AI_Executive_Briefing.pptx</w:t>
+    </w:r>
+  </w:p>
+  <w:p>
+    <w:pPr>
+      <w:jc w:val="center"/>
+    </w:pPr>
+    <w:r>
+      <w:rPr>
+        <w:color w:val="999999"/>
+        <w:sz w:val="18"/>
+      </w:rPr>
+      <w:t>Daniel Franco</w:t>
+    </w:r>
+  </w:p>
+  <w:p>
+    <w:pPr>
+      <w:pStyle w:val="Footer"/>
+    </w:pPr>
+  </w:p>
+</w:ftr>
+</file>
+
+<file path=word/footnotes.xml><?xml version="1.0" encoding="utf-8"?>
+<w:footnotes xmlns:wpc="http://schemas.microsoft.com/office/word/2010/wordprocessingCanvas" xmlns:cx="http://schemas.microsoft.com/office/drawing/2014/chartex" xmlns:cx1="http://schemas.microsoft.com/office/drawing/2015/9/8/chartex" xmlns:cx2="http://schemas.microsoft.com/office/drawing/2015/10/21/chartex" xmlns:cx3="http://schemas.microsoft.com/office/drawing/2016/5/9/chartex" xmlns:cx4="http://schemas.microsoft.com/office/drawing/2016/5/10/chartex" xmlns:cx5="http://schemas.microsoft.com/office/drawing/2016/5/11/chartex" xmlns:cx6="http://schemas.microsoft.com/office/drawing/2016/5/12/chartex" xmlns:cx7="http://schemas.microsoft.com/office/drawing/2016/5/13/chartex" xmlns:cx8="http://schemas.microsoft.com/office/drawing/2016/5/14/chartex" xmlns:mc="http://schemas.openxmlformats.org/markup-compatibility/2006" xmlns:aink="http://schemas.microsoft.com/office/drawing/2016/ink" xmlns:am3d="http://schemas.microsoft.com/office/drawing/2017/model3d" xmlns:o="urn:schemas-microsoft-com:office:office" xmlns:oel="http://schemas.microsoft.com/office/2019/extlst" xmlns:r="http://schemas.openxmlformats.org/officeDocument/2006/relationships" xmlns:m="http://schemas.openxmlformats.org/officeDocument/2006/math" xmlns:v="urn:schemas-microsoft-com:vml" xmlns:wp14="http://schemas.microsoft.com/office/word/2010/wordprocessingDrawing" xmlns:wp="http://schemas.openxmlformats.org/drawingml/2006/wordprocessingDrawing" xmlns:w10="urn:schemas-microsoft-com:office:word" xmlns:w="http://schemas.openxmlformats.org/wordprocessingml/2006/main" xmlns:w14="http://schemas.microsoft.com/office/word/2010/wordml" xmlns:w15="http://schemas.microsoft.com/office/word/2012/wordml" xmlns:w16cex="http://schemas.microsoft.com/office/word/2018/wordml/cex" xmlns:w16cid="http://schemas.microsoft.com/office/word/2016/wordml/cid" xmlns:w16="http://schemas.microsoft.com/office/word/2018/wordml" xmlns:w16du="http://schemas.microsoft.com/office/word/2023/wordml/word16du" xmlns:w16sdtdh="http://schemas.microsoft.com/office/word/2020/wordml/sdtdatahash" xmlns:w16sdtfl="http://schemas.microsoft.com/office/word/2024/wordml/sdtformatlock" xmlns:w16se="http://schemas.microsoft.com/office/word/2015/wordml/symex" xmlns:wpg="http://schemas.microsoft.com/office/word/2010/wordprocessingGroup" xmlns:wpi="http://schemas.microsoft.com/office/word/2010/wordprocessingInk" xmlns:wne="http://schemas.microsoft.com/office/word/2006/wordml" xmlns:wps="http://schemas.microsoft.com/office/word/2010/wordprocessingShape" mc:Ignorable="w14 w15 w16se w16cid w16 w16cex w16sdtdh w16sdtfl w16du wp14">
+  <w:footnote w:type="separator" w:id="-1">
+    <w:p>
+      <w:pPr>
+        <w:spacing w:after="0" w:line="240" w:lineRule="auto"/>
+      </w:pPr>
+      <w:r>
+        <w:separator/>
+      </w:r>
+    </w:p>
+  </w:footnote>
+  <w:footnote w:type="continuationSeparator" w:id="0">
+    <w:p>
+      <w:pPr>
+        <w:spacing w:after="0" w:line="240" w:lineRule="auto"/>
+      </w:pPr>
+      <w:r>
+        <w:continuationSeparator/>
+      </w:r>
+    </w:p>
+  </w:footnote>
+</w:footnotes>
 </file>
 
 <file path=word/numbering.xml><?xml version="1.0" encoding="utf-8"?>

</xml_diff>